<commit_message>
Limit explicit styled spaces to lines with known width
</commit_message>
<xml_diff>
--- a/fixtures/docx/features/StyledRepeatedSpaces.docx
+++ b/fixtures/docx/features/StyledRepeatedSpaces.docx
@@ -24,6 +24,70 @@
       </w:pPr>
       <w:r>
         <w:t>Alpha ·  Beta</w:t>
+      </w:r>
+    </w:p>
+    <w:tbl>
+      <w:tblPr>
+        <w:tblW w:type="auto" w:w="0"/>
+        <w:tblLayout w:type="fixed"/>
+        <w:tblLook w:firstColumn="1" w:firstRow="1" w:lastColumn="0" w:lastRow="0" w:noHBand="0" w:noVBand="1" w:val="04A0"/>
+      </w:tblPr>
+      <w:tblGrid>
+        <w:gridCol w:w="1656"/>
+      </w:tblGrid>
+      <w:tr>
+        <w:tc>
+          <w:tcPr>
+            <w:tcW w:type="dxa" w:w="1656"/>
+          </w:tcPr>
+          <w:p>
+            <w:pPr>
+              <w:pStyle w:val="Subtitle"/>
+            </w:pPr>
+            <w:r>
+              <w:t>AAAA BBBB Delta</w:t>
+            </w:r>
+          </w:p>
+        </w:tc>
+      </w:tr>
+      <w:tr>
+        <w:tc>
+          <w:tcPr>
+            <w:tcW w:type="dxa" w:w="1656"/>
+          </w:tcPr>
+          <w:p>
+            <w:pPr>
+              <w:pStyle w:val="Subtitle"/>
+            </w:pPr>
+            <w:r>
+              <w:t>AAAA BBBB  Delta</w:t>
+            </w:r>
+          </w:p>
+        </w:tc>
+      </w:tr>
+    </w:tbl>
+    <w:p>
+      <w:pPr>
+        <w:pStyle w:val="Subtitle"/>
+        <w:ind w:right="8208"/>
+      </w:pPr>
+      <w:r>
+        <w:t xml:space="preserve">AAAA BBBB </w:t>
+      </w:r>
+      <w:r>
+        <w:t>CCCC Omega</w:t>
+      </w:r>
+    </w:p>
+    <w:p>
+      <w:pPr>
+        <w:pStyle w:val="Subtitle"/>
+        <w:ind w:right="8208"/>
+      </w:pPr>
+      <w:r>
+        <w:t xml:space="preserve">AAAA BBBB </w:t>
+      </w:r>
+      <w:r>
+        <w:t>CCCC  Omega</w:t>
       </w:r>
     </w:p>
     <w:sectPr>

</xml_diff>

<commit_message>
Require complete styled run and effective font fit
</commit_message>
<xml_diff>
--- a/fixtures/docx/features/StyledRepeatedSpaces.docx
+++ b/fixtures/docx/features/StyledRepeatedSpaces.docx
@@ -88,6 +88,30 @@
       </w:r>
       <w:r>
         <w:t>CCCC  Omega</w:t>
+      </w:r>
+    </w:p>
+    <w:p>
+      <w:pPr>
+        <w:pStyle w:val="Subtitle"/>
+        <w:ind w:right="8208"/>
+      </w:pPr>
+      <w:r>
+        <w:t xml:space="preserve">AAAA BBBB CCCC </w:t>
+      </w:r>
+      <w:r>
+        <w:t>Theta</w:t>
+      </w:r>
+    </w:p>
+    <w:p>
+      <w:pPr>
+        <w:pStyle w:val="Subtitle"/>
+        <w:ind w:right="8208"/>
+      </w:pPr>
+      <w:r>
+        <w:t xml:space="preserve">AAAA BBBB CCCC  </w:t>
+      </w:r>
+      <w:r>
+        <w:t>Theta</w:t>
       </w:r>
     </w:p>
     <w:sectPr>

</xml_diff>

<commit_message>
Defer repeated-space collapse to PDF layout
</commit_message>
<xml_diff>
--- a/fixtures/docx/features/StyledRepeatedSpaces.docx
+++ b/fixtures/docx/features/StyledRepeatedSpaces.docx
@@ -112,6 +112,28 @@
       </w:r>
       <w:r>
         <w:t>Theta</w:t>
+      </w:r>
+    </w:p>
+    <w:p>
+      <w:pPr>
+        <w:pStyle w:val="Subtitle"/>
+      </w:pPr>
+      <w:r>
+        <w:rPr>
+          <w:caps/>
+        </w:rPr>
+        <w:t>Alpha Sigma</w:t>
+      </w:r>
+    </w:p>
+    <w:p>
+      <w:pPr>
+        <w:pStyle w:val="Subtitle"/>
+      </w:pPr>
+      <w:r>
+        <w:rPr>
+          <w:caps/>
+        </w:rPr>
+        <w:t>Alpha  Sigma</w:t>
       </w:r>
     </w:p>
     <w:sectPr>

</xml_diff>